<commit_message>
GitHub Project Link Change
</commit_message>
<xml_diff>
--- a/Project_Report.docx
+++ b/Project_Report.docx
@@ -266,20 +266,19 @@
         <w:rPr>
           <w:color w:val="2563EB"/>
         </w:rPr>
-        <w:tab/>
+        <w:t xml:space="preserve">        </w:t>
       </w:r>
       <w:r>
         <w:rPr>
           <w:color w:val="2563EB"/>
         </w:rPr>
-        <w:tab/>
-        <w:t xml:space="preserve">      </w:t>
+        <w:t xml:space="preserve"> </w:t>
       </w:r>
       <w:r>
         <w:rPr>
           <w:color w:val="2563EB"/>
         </w:rPr>
-        <w:t>https://github.com/SwapnanilBala/GG_SA</w:t>
+        <w:t>https://github.com/SwapnanilBala/GridGame_Dual_Search_Visualizer</w:t>
       </w:r>
     </w:p>
     <w:p>
@@ -2442,7 +2441,7 @@
         </w:rPr>
         <w:lastRenderedPageBreak/>
         <w:drawing>
-          <wp:inline distT="0" distB="0" distL="0" distR="0" wp14:anchorId="1A0B43FE" wp14:editId="1C6853EC">
+          <wp:inline distT="0" distB="0" distL="0" distR="0" wp14:anchorId="1A0B43FE" wp14:editId="5EF40D6E">
             <wp:extent cx="6539079" cy="3784600"/>
             <wp:effectExtent l="0" t="0" r="0" b="6350"/>
             <wp:docPr id="1482156686" name="Picture 15"/>
@@ -5121,7 +5120,7 @@
           <w:noProof/>
         </w:rPr>
         <w:drawing>
-          <wp:inline distT="0" distB="0" distL="0" distR="0" wp14:anchorId="7A4CE808" wp14:editId="5B1053B6">
+          <wp:inline distT="0" distB="0" distL="0" distR="0" wp14:anchorId="7A4CE808" wp14:editId="19D36C72">
             <wp:extent cx="6858000" cy="3348990"/>
             <wp:effectExtent l="0" t="0" r="0" b="3810"/>
             <wp:docPr id="510315254" name="Picture 11"/>
@@ -5745,7 +5744,7 @@
           <w:noProof/>
         </w:rPr>
         <w:drawing>
-          <wp:inline distT="0" distB="0" distL="0" distR="0" wp14:anchorId="5AEA9C4F" wp14:editId="69BB8CAA">
+          <wp:inline distT="0" distB="0" distL="0" distR="0" wp14:anchorId="5AEA9C4F" wp14:editId="297C1F8F">
             <wp:extent cx="6858000" cy="3348990"/>
             <wp:effectExtent l="0" t="0" r="0" b="3810"/>
             <wp:docPr id="1089360102" name="Picture 9"/>
@@ -6400,7 +6399,7 @@
           <w:noProof/>
         </w:rPr>
         <w:drawing>
-          <wp:inline distT="0" distB="0" distL="0" distR="0" wp14:anchorId="038BDBF5" wp14:editId="5FD782A3">
+          <wp:inline distT="0" distB="0" distL="0" distR="0" wp14:anchorId="038BDBF5" wp14:editId="25E6FCC7">
             <wp:extent cx="6858000" cy="3348990"/>
             <wp:effectExtent l="0" t="0" r="0" b="3810"/>
             <wp:docPr id="1017012131" name="Picture 7"/>
@@ -6978,7 +6977,7 @@
           <w:noProof/>
         </w:rPr>
         <w:drawing>
-          <wp:inline distT="0" distB="0" distL="0" distR="0" wp14:anchorId="72B10FAA" wp14:editId="0C381DAF">
+          <wp:inline distT="0" distB="0" distL="0" distR="0" wp14:anchorId="72B10FAA" wp14:editId="7FD19250">
             <wp:extent cx="6858000" cy="3348990"/>
             <wp:effectExtent l="0" t="0" r="0" b="3810"/>
             <wp:docPr id="421258340" name="Picture 5"/>
@@ -7580,7 +7579,7 @@
         </w:rPr>
         <w:lastRenderedPageBreak/>
         <w:drawing>
-          <wp:inline distT="0" distB="0" distL="0" distR="0" wp14:anchorId="58C8E9F6" wp14:editId="09513A59">
+          <wp:inline distT="0" distB="0" distL="0" distR="0" wp14:anchorId="58C8E9F6" wp14:editId="6C57CFF3">
             <wp:extent cx="6858000" cy="3348990"/>
             <wp:effectExtent l="0" t="0" r="0" b="3810"/>
             <wp:docPr id="168461535" name="Picture 3"/>

</xml_diff>